<commit_message>
Operating rules: add rule 19 (one complete answer) and rule 20 (send records after every batch)
Co-Authored-By: Claude Sonnet 5.5 <noreply@anthropic.com>
Claude-Session: https://claude.ai/code/session_01LkzTUs2QtGeQNwv7gJnBt1
</commit_message>
<xml_diff>
--- a/docs/Next_Owner_Market_Operating_Rules.docx
+++ b/docs/Next_Owner_Market_Operating_Rules.docx
@@ -20,7 +20,49 @@
           <w:iCs/>
           <w:i/>
         </w:rPr>
-        <w:t xml:space="preserve">The rules Claude follows on every Next Owner Market chat (and every project). They're saved in three places so nothing gets lost: the shayne-operating-rules skill on your Claude account, CLAUDE.md in the code, and Operating_Rules in the "Warehouse items" project.</w:t>
+        <w:t xml:space="preserve">The rules Claude follows on every Next Owner Market chat (and every project). They’re saved in three places so nothing gets lost: the shayne-operating-rules skill on your Claude account, CLAUDE.md in the code, and Operating_Rules in the</w:t>
+      </w:r>
+      <w:r>
+        <w:rPr>
+          <w:iCs/>
+          <w:i/>
+        </w:rPr>
+        <w:t xml:space="preserve"> </w:t>
+      </w:r>
+      <w:r>
+        <w:rPr>
+          <w:iCs/>
+          <w:i/>
+        </w:rPr>
+        <w:t xml:space="preserve">“</w:t>
+      </w:r>
+      <w:r>
+        <w:rPr>
+          <w:iCs/>
+          <w:i/>
+        </w:rPr>
+        <w:t xml:space="preserve">Warehouse items</w:t>
+      </w:r>
+      <w:r>
+        <w:rPr>
+          <w:iCs/>
+          <w:i/>
+        </w:rPr>
+        <w:t xml:space="preserve">”</w:t>
+      </w:r>
+      <w:r>
+        <w:rPr>
+          <w:iCs/>
+          <w:i/>
+        </w:rPr>
+        <w:t xml:space="preserve"> </w:t>
+      </w:r>
+      <w:r>
+        <w:rPr>
+          <w:iCs/>
+          <w:i/>
+        </w:rPr>
+        <w:t xml:space="preserve">project.</w:t>
       </w:r>
     </w:p>
     <w:p>
@@ -42,7 +84,7 @@
         <w:t xml:space="preserve"> </w:t>
       </w:r>
       <w:r>
-        <w:t xml:space="preserve">If a change can be made from Claude's side (code, database, hosting, web addresses, settings), Claude makes it. It sends you into a dashboard only when there is no other way. Then it says so in one line and gives exact copy-paste values and exact taps.</w:t>
+        <w:t xml:space="preserve">If a change can be made from Claude’s side (code, database, hosting, web addresses, settings), Claude makes it. It sends you into a dashboard only when there is no other way. Then it says so in one line and gives exact copy-paste values and exact taps.</w:t>
       </w:r>
     </w:p>
     <w:p>
@@ -64,7 +106,25 @@
         <w:t xml:space="preserve"> </w:t>
       </w:r>
       <w:r>
-        <w:t xml:space="preserve">or "go view" anything Claude can reach. Claude searches the web, reads the help page, checks the database and reads the code, then gives you the answer and the exact steps. It only sends you somewhere when that's truly out of its reach (your logins, your phone screen, a payment), and says so first.</w:t>
+        <w:t xml:space="preserve">or</w:t>
+      </w:r>
+      <w:r>
+        <w:t xml:space="preserve"> </w:t>
+      </w:r>
+      <w:r>
+        <w:t xml:space="preserve">“</w:t>
+      </w:r>
+      <w:r>
+        <w:t xml:space="preserve">go view</w:t>
+      </w:r>
+      <w:r>
+        <w:t xml:space="preserve">”</w:t>
+      </w:r>
+      <w:r>
+        <w:t xml:space="preserve"> </w:t>
+      </w:r>
+      <w:r>
+        <w:t xml:space="preserve">anything Claude can reach. Claude searches the web, reads the help page, checks the database and reads the code, then gives you the answer and the exact steps. It only sends you somewhere when that’s truly out of its reach (your logins, your phone screen, a payment), and says so first.</w:t>
       </w:r>
     </w:p>
     <w:p>
@@ -86,7 +146,7 @@
         <w:t xml:space="preserve"> </w:t>
       </w:r>
       <w:r>
-        <w:t xml:space="preserve">in apps Claude can't see. Look up the official steps first and quote them. Ask whether you're on your phone or your computer when the steps differ.</w:t>
+        <w:t xml:space="preserve">in apps Claude can’t see. Look up the official steps first and quote them. Ask whether you’re on your phone or your computer when the steps differ.</w:t>
       </w:r>
     </w:p>
     <w:p>
@@ -108,7 +168,7 @@
         <w:t xml:space="preserve"> </w:t>
       </w:r>
       <w:r>
-        <w:t xml:space="preserve">Never Google Drive, never links, never markdown only. A copy also goes in the project's docs folder.</w:t>
+        <w:t xml:space="preserve">Never Google Drive, never links, never markdown only. A copy also goes in the project’s docs folder.</w:t>
       </w:r>
     </w:p>
     <w:p>
@@ -174,7 +234,7 @@
         <w:t xml:space="preserve"> </w:t>
       </w:r>
       <w:r>
-        <w:t xml:space="preserve">pick from the phone's gallery first, camera second. Every pricing tool has both buttons.</w:t>
+        <w:t xml:space="preserve">pick from the phone’s gallery first, camera second. Every pricing tool has both buttons.</w:t>
       </w:r>
     </w:p>
     <w:p>
@@ -218,7 +278,7 @@
         <w:t xml:space="preserve"> </w:t>
       </w:r>
       <w:r>
-        <w:t xml:space="preserve">Ask for a screenshot if needed, and fix the layout so it can't be misread.</w:t>
+        <w:t xml:space="preserve">Ask for a screenshot if needed, and fix the layout so it can’t be misread.</w:t>
       </w:r>
     </w:p>
     <w:p>
@@ -256,13 +316,39 @@
           <w:bCs/>
           <w:b/>
         </w:rPr>
-        <w:t xml:space="preserve">"What do you think?"</w:t>
-      </w:r>
-      <w:r>
-        <w:t xml:space="preserve"> </w:t>
-      </w:r>
-      <w:r>
-        <w:t xml:space="preserve">gets an opinion with reasons, then Claude waits for your go, unless you already said "do it all."</w:t>
+        <w:t xml:space="preserve">“</w:t>
+      </w:r>
+      <w:r>
+        <w:rPr>
+          <w:bCs/>
+          <w:b/>
+        </w:rPr>
+        <w:t xml:space="preserve">What do you think?</w:t>
+      </w:r>
+      <w:r>
+        <w:rPr>
+          <w:bCs/>
+          <w:b/>
+        </w:rPr>
+        <w:t xml:space="preserve">”</w:t>
+      </w:r>
+      <w:r>
+        <w:t xml:space="preserve"> </w:t>
+      </w:r>
+      <w:r>
+        <w:t xml:space="preserve">gets an opinion with reasons, then Claude waits for your go, unless you already said</w:t>
+      </w:r>
+      <w:r>
+        <w:t xml:space="preserve"> </w:t>
+      </w:r>
+      <w:r>
+        <w:t xml:space="preserve">“</w:t>
+      </w:r>
+      <w:r>
+        <w:t xml:space="preserve">do it all.</w:t>
+      </w:r>
+      <w:r>
+        <w:t xml:space="preserve">”</w:t>
       </w:r>
     </w:p>
     <w:p>
@@ -394,7 +480,19 @@
         <w:t xml:space="preserve"> </w:t>
       </w:r>
       <w:r>
-        <w:t xml:space="preserve">In all marketing: "the AI writes your listings for nine sites; listing in our store is free."</w:t>
+        <w:t xml:space="preserve">In all marketing:</w:t>
+      </w:r>
+      <w:r>
+        <w:t xml:space="preserve"> </w:t>
+      </w:r>
+      <w:r>
+        <w:t xml:space="preserve">“</w:t>
+      </w:r>
+      <w:r>
+        <w:t xml:space="preserve">the AI writes your listings for nine sites; listing in our store is free.</w:t>
+      </w:r>
+      <w:r>
+        <w:t xml:space="preserve">”</w:t>
       </w:r>
     </w:p>
     <w:p>
@@ -416,7 +514,7 @@
         <w:t xml:space="preserve"> </w:t>
       </w:r>
       <w:r>
-        <w:t xml:space="preserve">Whatever can't be automated goes on the Operations page or your 📝 To-do list, with exact steps.</w:t>
+        <w:t xml:space="preserve">Whatever can’t be automated goes on the Operations page or your 📝 To-do list, with exact steps.</w:t>
       </w:r>
     </w:p>
     <w:p>
@@ -528,7 +626,7 @@
         <w:t xml:space="preserve"> </w:t>
       </w:r>
       <w:r>
-        <w:t xml:space="preserve">every conversation, both sides word for word (your messages and Claude's replies). It includes the arguments, the cussing, the corrections, the compliments and the back-and-forth, because how you and AI work together is the heart of the book. It runs from the first warehouse chats (Prologue, September 7–29), through day one (September 29), to now. Nothing is summarized in place of the real words.</w:t>
+        <w:t xml:space="preserve">every conversation, both sides word for word (your messages and Claude’s replies). It includes the arguments, the cussing, the corrections, the compliments and the back-and-forth, because how you and AI work together is the heart of the book. It runs from the first warehouse chats (Prologue, September 7–29), through day one (September 29), to now. Nothing is summarized in place of the real words.</w:t>
       </w:r>
     </w:p>
     <w:p>
@@ -574,7 +672,7 @@
         <w:pStyle w:val="Compact"/>
       </w:pPr>
       <w:r>
-        <w:t xml:space="preserve">Anything you say about AI, the journey or why you do this goes into the Mission Statement, with Claude's reply.</w:t>
+        <w:t xml:space="preserve">Anything you say about AI, the journey or why you do this goes into the Mission Statement, with Claude’s reply.</w:t>
       </w:r>
     </w:p>
     <w:p>
@@ -591,6 +689,200 @@
     </w:p>
     <w:p>
       <w:pPr>
+        <w:numPr>
+          <w:ilvl w:val="0"/>
+          <w:numId w:val="1001"/>
+        </w:numPr>
+        <w:pStyle w:val="Compact"/>
+      </w:pPr>
+      <w:r>
+        <w:rPr>
+          <w:bCs/>
+          <w:b/>
+        </w:rPr>
+        <w:t xml:space="preserve">One complete answer, first time, every field spelled out (added Oct 2, 2026).</w:t>
+      </w:r>
+    </w:p>
+    <w:p>
+      <w:pPr>
+        <w:numPr>
+          <w:ilvl w:val="1"/>
+          <w:numId w:val="1005"/>
+        </w:numPr>
+        <w:pStyle w:val="Compact"/>
+      </w:pPr>
+      <w:r>
+        <w:t xml:space="preserve">If something is knowable, the first answer is the final answer. Look it up first and check the real current state, including who controls it.</w:t>
+      </w:r>
+    </w:p>
+    <w:p>
+      <w:pPr>
+        <w:numPr>
+          <w:ilvl w:val="1"/>
+          <w:numId w:val="1005"/>
+        </w:numPr>
+        <w:pStyle w:val="Compact"/>
+      </w:pPr>
+      <w:r>
+        <w:t xml:space="preserve">Give ONE message with the exact count up front (</w:t>
+      </w:r>
+      <w:r>
+        <w:t xml:space="preserve">“</w:t>
+      </w:r>
+      <w:r>
+        <w:t xml:space="preserve">6 new, 2 edits</w:t>
+      </w:r>
+      <w:r>
+        <w:t xml:space="preserve">”</w:t>
+      </w:r>
+      <w:r>
+        <w:t xml:space="preserve">), then every item with every field written out (type, name, value, priority) and what to leave alone.</w:t>
+      </w:r>
+    </w:p>
+    <w:p>
+      <w:pPr>
+        <w:numPr>
+          <w:ilvl w:val="1"/>
+          <w:numId w:val="1005"/>
+        </w:numPr>
+        <w:pStyle w:val="Compact"/>
+      </w:pPr>
+      <w:r>
+        <w:t xml:space="preserve">Never change the list midstream, and keep the same order every time. If something has to change, say what changed and that you do not have to redo anything.</w:t>
+      </w:r>
+    </w:p>
+    <w:p>
+      <w:pPr>
+        <w:numPr>
+          <w:ilvl w:val="1"/>
+          <w:numId w:val="1005"/>
+        </w:numPr>
+        <w:pStyle w:val="Compact"/>
+      </w:pPr>
+      <w:r>
+        <w:t xml:space="preserve">Know how the screen behaves before you hit it (gray text in a box is a hint, not a value; Save stays gray until every opened form is filled or deleted). Read every field of your screenshots and spot empty required boxes before you have to ask.</w:t>
+      </w:r>
+    </w:p>
+    <w:p>
+      <w:pPr>
+        <w:numPr>
+          <w:ilvl w:val="1"/>
+          <w:numId w:val="1005"/>
+        </w:numPr>
+        <w:pStyle w:val="Compact"/>
+      </w:pPr>
+      <w:r>
+        <w:t xml:space="preserve">After you save, Claude checks it live and tells you. You are never sent to check.</w:t>
+      </w:r>
+    </w:p>
+    <w:p>
+      <w:pPr>
+        <w:numPr>
+          <w:ilvl w:val="1"/>
+          <w:numId w:val="1005"/>
+        </w:numPr>
+        <w:pStyle w:val="Compact"/>
+      </w:pPr>
+      <w:r>
+        <w:t xml:space="preserve">Why this exists: the shayneforva.com DNS fix took over 30 minutes and should have taken 5.</w:t>
+      </w:r>
+    </w:p>
+    <w:p>
+      <w:pPr>
+        <w:numPr>
+          <w:ilvl w:val="0"/>
+          <w:numId w:val="1001"/>
+        </w:numPr>
+        <w:pStyle w:val="Compact"/>
+      </w:pPr>
+      <w:r>
+        <w:rPr>
+          <w:bCs/>
+          <w:b/>
+        </w:rPr>
+        <w:t xml:space="preserve">Send the records after EVERY batch, however small (added Oct 2, 2026).</w:t>
+      </w:r>
+    </w:p>
+    <w:p>
+      <w:pPr>
+        <w:numPr>
+          <w:ilvl w:val="1"/>
+          <w:numId w:val="1006"/>
+        </w:numPr>
+        <w:pStyle w:val="Compact"/>
+      </w:pPr>
+      <w:r>
+        <w:t xml:space="preserve">No</w:t>
+      </w:r>
+      <w:r>
+        <w:t xml:space="preserve"> </w:t>
+      </w:r>
+      <w:r>
+        <w:t xml:space="preserve">“</w:t>
+      </w:r>
+      <w:r>
+        <w:t xml:space="preserve">too small to send.</w:t>
+      </w:r>
+      <w:r>
+        <w:t xml:space="preserve">”</w:t>
+      </w:r>
+      <w:r>
+        <w:t xml:space="preserve"> </w:t>
+      </w:r>
+      <w:r>
+        <w:t xml:space="preserve">After any deploy or change, the Build Journal, Change Log and Operating Rules .docx files come into the chat.</w:t>
+      </w:r>
+    </w:p>
+    <w:p>
+      <w:pPr>
+        <w:numPr>
+          <w:ilvl w:val="1"/>
+          <w:numId w:val="1006"/>
+        </w:numPr>
+        <w:pStyle w:val="Compact"/>
+      </w:pPr>
+      <w:r>
+        <w:t xml:space="preserve">The back and forth is the book, and the updated files are what gets passed to the next app.</w:t>
+      </w:r>
+    </w:p>
+    <w:p>
+      <w:pPr>
+        <w:numPr>
+          <w:ilvl w:val="1"/>
+          <w:numId w:val="1006"/>
+        </w:numPr>
+        <w:pStyle w:val="Compact"/>
+      </w:pPr>
+      <w:r>
+        <w:t xml:space="preserve">These rules live in the master files (this document, the Claude skill, each project’s CLAUDE.md), not only in Claude’s memory.</w:t>
+      </w:r>
+    </w:p>
+    <w:p>
+      <w:pPr>
+        <w:numPr>
+          <w:ilvl w:val="1"/>
+          <w:numId w:val="1006"/>
+        </w:numPr>
+        <w:pStyle w:val="Compact"/>
+      </w:pPr>
+      <w:r>
+        <w:t xml:space="preserve">On the political posting app a Stop hook blocks Claude from ending a turn if there is a change newer than the last send. Every new project gets the same scripts and hook first.</w:t>
+      </w:r>
+    </w:p>
+    <w:p>
+      <w:pPr>
+        <w:numPr>
+          <w:ilvl w:val="1"/>
+          <w:numId w:val="1006"/>
+        </w:numPr>
+        <w:pStyle w:val="Compact"/>
+      </w:pPr>
+      <w:r>
+        <w:t xml:space="preserve">Why this exists: a fix on Oct 2 at 6:14 PM was deployed and the files were not sent until he pointed it out.</w:t>
+      </w:r>
+    </w:p>
+    <w:p>
+      <w:pPr>
         <w:pStyle w:val="FirstParagraph"/>
       </w:pPr>
       <w:r>
@@ -604,7 +896,37 @@
         <w:t xml:space="preserve"> </w:t>
       </w:r>
       <w:r>
-        <w:t xml:space="preserve">one 25,000 sq ft warehouse with over 300 pallets. Never "three warehouses" or "400 pallets."</w:t>
+        <w:t xml:space="preserve">one 25,000 sq ft warehouse with over 300 pallets. Never</w:t>
+      </w:r>
+      <w:r>
+        <w:t xml:space="preserve"> </w:t>
+      </w:r>
+      <w:r>
+        <w:t xml:space="preserve">“</w:t>
+      </w:r>
+      <w:r>
+        <w:t xml:space="preserve">three warehouses</w:t>
+      </w:r>
+      <w:r>
+        <w:t xml:space="preserve">”</w:t>
+      </w:r>
+      <w:r>
+        <w:t xml:space="preserve"> </w:t>
+      </w:r>
+      <w:r>
+        <w:t xml:space="preserve">or</w:t>
+      </w:r>
+      <w:r>
+        <w:t xml:space="preserve"> </w:t>
+      </w:r>
+      <w:r>
+        <w:t xml:space="preserve">“</w:t>
+      </w:r>
+      <w:r>
+        <w:t xml:space="preserve">400 pallets.</w:t>
+      </w:r>
+      <w:r>
+        <w:t xml:space="preserve">”</w:t>
       </w:r>
     </w:p>
     <w:bookmarkEnd w:id="20"/>
@@ -915,6 +1237,12 @@
     <w:abstractNumId w:val="991"/>
   </w:num>
   <w:num w:numId="1004">
+    <w:abstractNumId w:val="991"/>
+  </w:num>
+  <w:num w:numId="1005">
+    <w:abstractNumId w:val="991"/>
+  </w:num>
+  <w:num w:numId="1006">
     <w:abstractNumId w:val="991"/>
   </w:num>
 </w:numbering>

</xml_diff>